<commit_message>
Final Soft Computing submission package
Fix issues found in review of the Word draft: six contributions, numbered
sections and equations, split Table 3 caption, single parenthetical
citations, ten Berge particle, restore Ravselj et al. (2025b) and cite the
2026 correction, complete funding/code/AI-use declarations. Add title page,
cover letter, supplementary information (Tables S1-S14, Fig. S1), numbered
figure files and a submission checklist.

Co-Authored-By: Claude Opus 5.5 <noreply@anthropic.com>
Claude-Session: https://claude.ai/code/session_012KJjXTygbbaRu18X7bbzfR
</commit_message>
<xml_diff>
--- a/ai-teacher-feasibility/manuscript_softcomputing/AI_teacher_feasibility_SoftComputing.docx
+++ b/ai-teacher-feasibility/manuscript_softcomputing/AI_teacher_feasibility_SoftComputing.docx
@@ -25,6 +25,9 @@
         <w:br/>
       </w:r>
       <w:r>
+        <w:rPr>
+          <w:highlight w:val="yellow"/>
+        </w:rPr>
         <w:t xml:space="preserve">Department of Computer Science and Engineering, [University name], [City], [Country]</w:t>
       </w:r>
       <w:r>
@@ -196,6 +199,15 @@
         <w:pStyle w:val="Heading1"/>
       </w:pPr>
       <w:r>
+        <w:rPr>
+          <w:rStyle w:val="SectionNumber"/>
+        </w:rPr>
+        <w:t xml:space="preserve">1</w:t>
+      </w:r>
+      <w:r>
+        <w:tab/>
+      </w:r>
+      <w:r>
         <w:t xml:space="preserve">Introduction</w:t>
       </w:r>
     </w:p>
@@ -382,7 +394,7 @@
         <w:pStyle w:val="BodyText"/>
       </w:pPr>
       <w:r>
-        <w:t xml:space="preserve">This study develops and empirically tests such a framework. We make four contributions:</w:t>
+        <w:t xml:space="preserve">This study develops and empirically tests such a framework. We make six contributions:</w:t>
       </w:r>
     </w:p>
     <w:p>
@@ -420,16 +432,16 @@
         </w:numPr>
       </w:pPr>
       <w:r>
-        <w:t xml:space="preserve">We operationalise the framework on a large, open, multinational dataset (the Global ChatGPT Student Survey;</w:t>
-      </w:r>
-      <w:r>
-        <w:t xml:space="preserve"> </w:t>
-      </w:r>
-      <w:r>
-        <w:t xml:space="preserve">(Ravšelj et al. 2025b, 2025a)</w:t>
-      </w:r>
-      <w:r>
-        <w:t xml:space="preserve">). The eight-factor measurement model is validated by confirmatory factor analysis before any soft-computing step.</w:t>
+        <w:t xml:space="preserve">We operationalise the framework on a large, open, multinational dataset</w:t>
+      </w:r>
+      <w:r>
+        <w:t xml:space="preserve"> </w:t>
+      </w:r>
+      <w:r>
+        <w:t xml:space="preserve">(the Global ChatGPT Student Survey; Ravšelj et al. 2025b, 2025a)</w:t>
+      </w:r>
+      <w:r>
+        <w:t xml:space="preserve">. The eight-factor measurement model is validated by confirmatory factor analysis before any soft-computing step.</w:t>
       </w:r>
     </w:p>
     <w:p>
@@ -580,6 +592,15 @@
         <w:pStyle w:val="Heading1"/>
       </w:pPr>
       <w:r>
+        <w:rPr>
+          <w:rStyle w:val="SectionNumber"/>
+        </w:rPr>
+        <w:t xml:space="preserve">2</w:t>
+      </w:r>
+      <w:r>
+        <w:tab/>
+      </w:r>
+      <w:r>
         <w:t xml:space="preserve">Related work</w:t>
       </w:r>
     </w:p>
@@ -588,6 +609,15 @@
       <w:pPr>
         <w:pStyle w:val="Heading2"/>
       </w:pPr>
+      <w:r>
+        <w:rPr>
+          <w:rStyle w:val="SectionNumber"/>
+        </w:rPr>
+        <w:t xml:space="preserve">2.1</w:t>
+      </w:r>
+      <w:r>
+        <w:tab/>
+      </w:r>
       <w:r>
         <w:t xml:space="preserve">AI and generative AI in higher education</w:t>
       </w:r>
@@ -664,6 +694,15 @@
         <w:pStyle w:val="Heading2"/>
       </w:pPr>
       <w:r>
+        <w:rPr>
+          <w:rStyle w:val="SectionNumber"/>
+        </w:rPr>
+        <w:t xml:space="preserve">2.2</w:t>
+      </w:r>
+      <w:r>
+        <w:tab/>
+      </w:r>
+      <w:r>
         <w:t xml:space="preserve">Can AI replace teachers?</w:t>
       </w:r>
     </w:p>
@@ -777,6 +816,15 @@
         <w:pStyle w:val="Heading2"/>
       </w:pPr>
       <w:r>
+        <w:rPr>
+          <w:rStyle w:val="SectionNumber"/>
+        </w:rPr>
+        <w:t xml:space="preserve">2.3</w:t>
+      </w:r>
+      <w:r>
+        <w:tab/>
+      </w:r>
+      <w:r>
         <w:t xml:space="preserve">Soft computing for educational evaluation</w:t>
       </w:r>
     </w:p>
@@ -860,6 +908,15 @@
       <w:pPr>
         <w:pStyle w:val="Heading2"/>
       </w:pPr>
+      <w:r>
+        <w:rPr>
+          <w:rStyle w:val="SectionNumber"/>
+        </w:rPr>
+        <w:t xml:space="preserve">2.4</w:t>
+      </w:r>
+      <w:r>
+        <w:tab/>
+      </w:r>
       <w:r>
         <w:t xml:space="preserve">Research gap</w:t>
       </w:r>
@@ -905,6 +962,15 @@
       <w:pPr>
         <w:pStyle w:val="Heading1"/>
       </w:pPr>
+      <w:r>
+        <w:rPr>
+          <w:rStyle w:val="SectionNumber"/>
+        </w:rPr>
+        <w:t xml:space="preserve">3</w:t>
+      </w:r>
+      <w:r>
+        <w:tab/>
+      </w:r>
       <w:r>
         <w:t xml:space="preserve">Proposed framework</w:t>
       </w:r>
@@ -1333,6 +1399,25 @@
             </m:rPr>
             <m:t>.</m:t>
           </m:r>
+          <m:r>
+            <m:t>  </m:t>
+          </m:r>
+          <m:r>
+            <m:t>  </m:t>
+          </m:r>
+          <m:d>
+            <m:dPr>
+              <m:begChr m:val="("/>
+              <m:endChr m:val=")"/>
+              <m:sepChr m:val=""/>
+              <m:grow/>
+            </m:dPr>
+            <m:e>
+              <m:r>
+                <m:t>1</m:t>
+              </m:r>
+            </m:e>
+          </m:d>
         </m:oMath>
       </m:oMathPara>
     </w:p>
@@ -1440,7 +1525,7 @@
               <a:graphicData uri="http://schemas.openxmlformats.org/drawingml/2006/picture">
                 <pic:pic>
                   <pic:nvPicPr>
-                    <pic:cNvPr descr="/tmp/claude-0/docx/fig1_framework.png" id="29" name="Picture"/>
+                    <pic:cNvPr descr="/tmp/claude-0/docx2/fig1_framework.png" id="29" name="Picture"/>
                     <pic:cNvPicPr>
                       <a:picLocks noChangeArrowheads="1" noChangeAspect="1"/>
                     </pic:cNvPicPr>
@@ -1487,6 +1572,15 @@
         <w:pStyle w:val="Heading2"/>
       </w:pPr>
       <w:r>
+        <w:rPr>
+          <w:rStyle w:val="SectionNumber"/>
+        </w:rPr>
+        <w:t xml:space="preserve">3.1</w:t>
+      </w:r>
+      <w:r>
+        <w:tab/>
+      </w:r>
+      <w:r>
         <w:t xml:space="preserve">Mathematical properties of the framework</w:t>
       </w:r>
     </w:p>
@@ -2711,7 +2805,7 @@
     <w:bookmarkStart w:id="30" w:name="consequent-centroids"/>
     <w:p>
       <w:pPr>
-        <w:pStyle w:val="Heading4"/>
+        <w:pStyle w:val="Heading3"/>
       </w:pPr>
       <w:r>
         <w:t xml:space="preserve">Consequent centroids</w:t>
@@ -3056,6 +3150,25 @@
             </m:rPr>
             <m:t>,</m:t>
           </m:r>
+          <m:r>
+            <m:t>  </m:t>
+          </m:r>
+          <m:r>
+            <m:t>  </m:t>
+          </m:r>
+          <m:d>
+            <m:dPr>
+              <m:begChr m:val="("/>
+              <m:endChr m:val=")"/>
+              <m:sepChr m:val=""/>
+              <m:grow/>
+            </m:dPr>
+            <m:e>
+              <m:r>
+                <m:t>2</m:t>
+              </m:r>
+            </m:e>
+          </m:d>
         </m:oMath>
       </m:oMathPara>
     </w:p>
@@ -3347,7 +3460,7 @@
     <w:bookmarkStart w:id="34" w:name="a-provably-monotone-inference-variant"/>
     <w:p>
       <w:pPr>
-        <w:pStyle w:val="Heading4"/>
+        <w:pStyle w:val="Heading3"/>
       </w:pPr>
       <w:r>
         <w:t xml:space="preserve">A provably monotone inference variant</w:t>
@@ -3734,6 +3847,25 @@
             </m:rPr>
             <m:t>,</m:t>
           </m:r>
+          <m:r>
+            <m:t>  </m:t>
+          </m:r>
+          <m:r>
+            <m:t>  </m:t>
+          </m:r>
+          <m:d>
+            <m:dPr>
+              <m:begChr m:val="("/>
+              <m:endChr m:val=")"/>
+              <m:sepChr m:val=""/>
+              <m:grow/>
+            </m:dPr>
+            <m:e>
+              <m:r>
+                <m:t>3</m:t>
+              </m:r>
+            </m:e>
+          </m:d>
         </m:oMath>
       </m:oMathPara>
     </w:p>
@@ -7575,6 +7707,15 @@
         <w:pStyle w:val="Heading1"/>
       </w:pPr>
       <w:r>
+        <w:rPr>
+          <w:rStyle w:val="SectionNumber"/>
+        </w:rPr>
+        <w:t xml:space="preserve">4</w:t>
+      </w:r>
+      <w:r>
+        <w:tab/>
+      </w:r>
+      <w:r>
         <w:t xml:space="preserve">Materials and methods</w:t>
       </w:r>
     </w:p>
@@ -7584,6 +7725,15 @@
         <w:pStyle w:val="Heading2"/>
       </w:pPr>
       <w:r>
+        <w:rPr>
+          <w:rStyle w:val="SectionNumber"/>
+        </w:rPr>
+        <w:t xml:space="preserve">4.1</w:t>
+      </w:r>
+      <w:r>
+        <w:tab/>
+      </w:r>
+      <w:r>
         <w:t xml:space="preserve">Data source</w:t>
       </w:r>
     </w:p>
@@ -7618,6 +7768,18 @@
       </w:r>
       <w:r>
         <w:t xml:space="preserve">Ravšelj et al. (2025b)</w:t>
+      </w:r>
+      <w:r>
+        <w:t xml:space="preserve"> </w:t>
+      </w:r>
+      <w:r>
+        <w:t xml:space="preserve">and its published correction</w:t>
+      </w:r>
+      <w:r>
+        <w:t xml:space="preserve"> </w:t>
+      </w:r>
+      <w:r>
+        <w:t xml:space="preserve">(Ravšelj et al. 2026)</w:t>
       </w:r>
       <w:r>
         <w:t xml:space="preserve">. The survey was coordinated by the University of Ljubljana with more than 200 international partners. It was administered online in seven languages between October 2023 and February 2024, using convenience sampling of students enrolled in higher education institutions. Participation was voluntary and anonymous, and respondents gave informed consent; the questionnaire is distributed with the dataset. It comprises eleven sections, including usage, perceived capabilities of ChatGPT, regulation and ethical concerns, satisfaction and attitude, study issues and outcomes, and skills development. Almost all items use five-point Likert scales (1 = strongly disagree, 5 = strongly agree). The released file contains 23,218 responses and 174 variables. Because the study is a secondary analysis of fully anonymised open data, no additional ethical approval was required. Free-text institution names were removed from all derived files.</w:t>
@@ -7629,6 +7791,15 @@
       <w:pPr>
         <w:pStyle w:val="Heading2"/>
       </w:pPr>
+      <w:r>
+        <w:rPr>
+          <w:rStyle w:val="SectionNumber"/>
+        </w:rPr>
+        <w:t xml:space="preserve">4.2</w:t>
+      </w:r>
+      <w:r>
+        <w:tab/>
+      </w:r>
       <w:r>
         <w:t xml:space="preserve">Analytic sample</w:t>
       </w:r>
@@ -8863,13 +9034,22 @@
         <w:pStyle w:val="Heading2"/>
       </w:pPr>
       <w:r>
+        <w:rPr>
+          <w:rStyle w:val="SectionNumber"/>
+        </w:rPr>
+        <w:t xml:space="preserve">4.3</w:t>
+      </w:r>
+      <w:r>
+        <w:tab/>
+      </w:r>
+      <w:r>
         <w:t xml:space="preserve">Operationalisation</w:t>
       </w:r>
     </w:p>
     <w:bookmarkStart w:id="39" w:name="evaluation-factors"/>
     <w:p>
       <w:pPr>
-        <w:pStyle w:val="Heading4"/>
+        <w:pStyle w:val="Heading3"/>
       </w:pPr>
       <w:r>
         <w:t xml:space="preserve">Evaluation factors</w:t>
@@ -8938,7 +9118,7 @@
     <w:bookmarkStart w:id="40" w:name="teaching-activities"/>
     <w:p>
       <w:pPr>
-        <w:pStyle w:val="Heading4"/>
+        <w:pStyle w:val="Heading3"/>
       </w:pPr>
       <w:r>
         <w:t xml:space="preserve">Teaching activities</w:t>
@@ -9101,7 +9281,7 @@
     <w:bookmarkStart w:id="41" w:name="independent-criterion"/>
     <w:p>
       <w:pPr>
-        <w:pStyle w:val="Heading4"/>
+        <w:pStyle w:val="Heading3"/>
       </w:pPr>
       <w:r>
         <w:t xml:space="preserve">Independent criterion</w:t>
@@ -9175,6 +9355,15 @@
         <w:pStyle w:val="Heading2"/>
       </w:pPr>
       <w:r>
+        <w:rPr>
+          <w:rStyle w:val="SectionNumber"/>
+        </w:rPr>
+        <w:t xml:space="preserve">4.4</w:t>
+      </w:r>
+      <w:r>
+        <w:tab/>
+      </w:r>
+      <w:r>
         <w:t xml:space="preserve">Measurement validation</w:t>
       </w:r>
     </w:p>
@@ -9224,16 +9413,16 @@
         <w:t xml:space="preserve"> </w:t>
       </w:r>
       <w:r>
-        <w:t xml:space="preserve">and the heterotrait–monotrait ratio (HTMT; threshold 0.85,</w:t>
-      </w:r>
-      <w:r>
-        <w:t xml:space="preserve"> </w:t>
-      </w:r>
-      <w:r>
-        <w:t xml:space="preserve">(Henseler, Ringle, and Sarstedt 2015)</w:t>
-      </w:r>
-      <w:r>
-        <w:t xml:space="preserve">). Because all variables come from one self-report instrument, common-method variance was screened with Harman’s single-factor test</w:t>
+        <w:t xml:space="preserve">and the heterotrait–monotrait ratio</w:t>
+      </w:r>
+      <w:r>
+        <w:t xml:space="preserve"> </w:t>
+      </w:r>
+      <w:r>
+        <w:t xml:space="preserve">(HTMT; threshold 0.85, Henseler, Ringle, and Sarstedt 2015)</w:t>
+      </w:r>
+      <w:r>
+        <w:t xml:space="preserve">. Because all variables come from one self-report instrument, common-method variance was screened with Harman’s single-factor test</w:t>
       </w:r>
       <w:r>
         <w:t xml:space="preserve"> </w:t>
@@ -9252,13 +9441,22 @@
         <w:pStyle w:val="Heading2"/>
       </w:pPr>
       <w:r>
+        <w:rPr>
+          <w:rStyle w:val="SectionNumber"/>
+        </w:rPr>
+        <w:t xml:space="preserve">4.5</w:t>
+      </w:r>
+      <w:r>
+        <w:tab/>
+      </w:r>
+      <w:r>
         <w:t xml:space="preserve">Hierarchical fuzzy inference system</w:t>
       </w:r>
     </w:p>
     <w:bookmarkStart w:id="47" w:name="fuzzification"/>
     <w:p>
       <w:pPr>
-        <w:pStyle w:val="Heading4"/>
+        <w:pStyle w:val="Heading3"/>
       </w:pPr>
       <w:r>
         <w:t xml:space="preserve">Fuzzification</w:t>
@@ -9685,6 +9883,25 @@
               </m:e>
             </m:mr>
           </m:m>
+          <m:r>
+            <m:t>  </m:t>
+          </m:r>
+          <m:r>
+            <m:t>  </m:t>
+          </m:r>
+          <m:d>
+            <m:dPr>
+              <m:begChr m:val="("/>
+              <m:endChr m:val=")"/>
+              <m:sepChr m:val=""/>
+              <m:grow/>
+            </m:dPr>
+            <m:e>
+              <m:r>
+                <m:t>4</m:t>
+              </m:r>
+            </m:e>
+          </m:d>
         </m:oMath>
       </m:oMathPara>
     </w:p>
@@ -10094,6 +10311,25 @@
               </m:e>
             </m:mr>
           </m:m>
+          <m:r>
+            <m:t>  </m:t>
+          </m:r>
+          <m:r>
+            <m:t>  </m:t>
+          </m:r>
+          <m:d>
+            <m:dPr>
+              <m:begChr m:val="("/>
+              <m:endChr m:val=")"/>
+              <m:sepChr m:val=""/>
+              <m:grow/>
+            </m:dPr>
+            <m:e>
+              <m:r>
+                <m:t>5</m:t>
+              </m:r>
+            </m:e>
+          </m:d>
         </m:oMath>
       </m:oMathPara>
     </w:p>
@@ -10164,7 +10400,7 @@
     <w:bookmarkStart w:id="48" w:name="rule-bases"/>
     <w:p>
       <w:pPr>
-        <w:pStyle w:val="Heading4"/>
+        <w:pStyle w:val="Heading3"/>
       </w:pPr>
       <w:r>
         <w:t xml:space="preserve">Rule bases</w:t>
@@ -10432,7 +10668,7 @@
         <w:pStyle w:val="TableCaption"/>
       </w:pPr>
       <w:r>
-        <w:t xml:space="preserve">Table 3. Rule bases of the trust sub-system FIS</w:t>
+        <w:t xml:space="preserve">Table 3a. Rule base of the trust sub-system FIS</w:t>
       </w:r>
       <m:oMath>
         <m:sSub>
@@ -10452,27 +10688,7 @@
         <w:t xml:space="preserve"> </w:t>
       </w:r>
       <w:r>
-        <w:t xml:space="preserve">(top) and the final system FIS</w:t>
-      </w:r>
-      <m:oMath>
-        <m:sSub>
-          <m:e>
-            <m:r>
-              <m:t>​</m:t>
-            </m:r>
-          </m:e>
-          <m:sub>
-            <m:r>
-              <m:t>4</m:t>
-            </m:r>
-          </m:sub>
-        </m:sSub>
-      </m:oMath>
-      <w:r>
-        <w:t xml:space="preserve"> </w:t>
-      </w:r>
-      <w:r>
-        <w:t xml:space="preserve">(bottom; L/M/H = Low/Medium/High).</w:t>
+        <w:t xml:space="preserve">(TW as a function of R and E).</w:t>
       </w:r>
     </w:p>
     <w:tbl>
@@ -10480,7 +10696,7 @@
         <w:tblStyle w:val="Table"/>
         <w:tblLook w:firstRow="1" w:lastRow="0" w:firstColumn="0" w:lastColumn="0" w:noHBand="0" w:noVBand="0" w:val="0020"/>
         <w:jc w:val="start"/>
-        <w:tblCaption w:val="Table 3. Rule bases of the trust sub-system FIS_3 (top) and the final system FIS_4 (bottom; L/M/H = Low/Medium/High)."/>
+        <w:tblCaption w:val="Table 3a. Rule base of the trust sub-system FIS_3 (TW as a function of R and E)."/>
         <w:tblW w:w="5000" w:type="pct"/>
         <w:tblLayout w:type="autofit"/>
         <w:tblBorders>
@@ -10809,7 +11025,7 @@
         <w:pStyle w:val="TableCaption"/>
       </w:pPr>
       <w:r>
-        <w:t xml:space="preserve">Table 3. Rule bases of the trust sub-system FIS</w:t>
+        <w:t xml:space="preserve">Table 3b. Rule base of the final system FIS</w:t>
       </w:r>
       <m:oMath>
         <m:sSub>
@@ -10820,7 +11036,7 @@
           </m:e>
           <m:sub>
             <m:r>
-              <m:t>3</m:t>
+              <m:t>4</m:t>
             </m:r>
           </m:sub>
         </m:sSub>
@@ -10829,27 +11045,7 @@
         <w:t xml:space="preserve"> </w:t>
       </w:r>
       <w:r>
-        <w:t xml:space="preserve">(top) and the final system FIS</w:t>
-      </w:r>
-      <m:oMath>
-        <m:sSub>
-          <m:e>
-            <m:r>
-              <m:t>​</m:t>
-            </m:r>
-          </m:e>
-          <m:sub>
-            <m:r>
-              <m:t>4</m:t>
-            </m:r>
-          </m:sub>
-        </m:sSub>
-      </m:oMath>
-      <w:r>
-        <w:t xml:space="preserve"> </w:t>
-      </w:r>
-      <w:r>
-        <w:t xml:space="preserve">(bottom; L/M/H = Low/Medium/High).</w:t>
+        <w:t xml:space="preserve">(L/M/H = Low/Medium/High).</w:t>
       </w:r>
     </w:p>
     <w:tbl>
@@ -10857,7 +11053,7 @@
         <w:tblStyle w:val="Table"/>
         <w:tblLook w:firstRow="1" w:lastRow="0" w:firstColumn="0" w:lastColumn="0" w:noHBand="0" w:noVBand="0" w:val="0020"/>
         <w:jc w:val="start"/>
-        <w:tblCaption w:val="Table 3. Rule bases of the trust sub-system FIS_3 (top) and the final system FIS_4 (bottom; L/M/H = Low/Medium/High)."/>
+        <w:tblCaption w:val="Table 3b. Rule base of the final system FIS_4 (L/M/H = Low/Medium/High)."/>
         <w:tblW w:w="5000" w:type="pct"/>
         <w:tblLayout w:type="autofit"/>
         <w:tblBorders>
@@ -13385,7 +13581,7 @@
     <w:bookmarkStart w:id="49" w:name="inference-and-defuzzification"/>
     <w:p>
       <w:pPr>
-        <w:pStyle w:val="Heading4"/>
+        <w:pStyle w:val="Heading3"/>
       </w:pPr>
       <w:r>
         <w:t xml:space="preserve">Inference and defuzzification</w:t>
@@ -13779,6 +13975,25 @@
             </m:rPr>
             <m:t>,</m:t>
           </m:r>
+          <m:r>
+            <m:t>  </m:t>
+          </m:r>
+          <m:r>
+            <m:t>  </m:t>
+          </m:r>
+          <m:d>
+            <m:dPr>
+              <m:begChr m:val="("/>
+              <m:endChr m:val=")"/>
+              <m:sepChr m:val=""/>
+              <m:grow/>
+            </m:dPr>
+            <m:e>
+              <m:r>
+                <m:t>6</m:t>
+              </m:r>
+            </m:e>
+          </m:d>
         </m:oMath>
       </m:oMathPara>
     </w:p>
@@ -13853,7 +14068,7 @@
     <w:bookmarkStart w:id="50" w:name="decision-categories"/>
     <w:p>
       <w:pPr>
-        <w:pStyle w:val="Heading4"/>
+        <w:pStyle w:val="Heading3"/>
       </w:pPr>
       <w:r>
         <w:t xml:space="preserve">Decision categories</w:t>
@@ -13978,6 +14193,15 @@
       <w:pPr>
         <w:pStyle w:val="Heading2"/>
       </w:pPr>
+      <w:r>
+        <w:rPr>
+          <w:rStyle w:val="SectionNumber"/>
+        </w:rPr>
+        <w:t xml:space="preserve">4.6</w:t>
+      </w:r>
+      <w:r>
+        <w:tab/>
+      </w:r>
       <w:r>
         <w:t xml:space="preserve">Activity-level fuzzy system</w:t>
       </w:r>
@@ -14295,16 +14519,16 @@
         </m:r>
       </m:oMath>
       <w:r>
-        <w:t xml:space="preserve">. Each activity is classified by its mean score; we also report the share of respondents in each category and bootstrap 95% confidence intervals (2000 resamples;</w:t>
-      </w:r>
-      <w:r>
-        <w:t xml:space="preserve"> </w:t>
-      </w:r>
-      <w:r>
-        <w:t xml:space="preserve">(Efron and Tibshirani 1993)</w:t>
-      </w:r>
-      <w:r>
-        <w:t xml:space="preserve">). Differences between activities were tested with the Friedman test</w:t>
+        <w:t xml:space="preserve">. Each activity is classified by its mean score; we also report the share of respondents in each category and bootstrap 95% confidence intervals</w:t>
+      </w:r>
+      <w:r>
+        <w:t xml:space="preserve"> </w:t>
+      </w:r>
+      <w:r>
+        <w:t xml:space="preserve">(2000 resamples; Efron and Tibshirani 1993)</w:t>
+      </w:r>
+      <w:r>
+        <w:t xml:space="preserve">. Differences between activities were tested with the Friedman test</w:t>
       </w:r>
       <w:r>
         <w:t xml:space="preserve"> </w:t>
@@ -14360,6 +14584,15 @@
         <w:pStyle w:val="Heading2"/>
       </w:pPr>
       <w:r>
+        <w:rPr>
+          <w:rStyle w:val="SectionNumber"/>
+        </w:rPr>
+        <w:t xml:space="preserve">4.7</w:t>
+      </w:r>
+      <w:r>
+        <w:tab/>
+      </w:r>
+      <w:r>
         <w:t xml:space="preserve">Neural network and benchmark models</w:t>
       </w:r>
     </w:p>
@@ -14651,6 +14884,15 @@
         <w:pStyle w:val="Heading2"/>
       </w:pPr>
       <w:r>
+        <w:rPr>
+          <w:rStyle w:val="SectionNumber"/>
+        </w:rPr>
+        <w:t xml:space="preserve">4.8</w:t>
+      </w:r>
+      <w:r>
+        <w:tab/>
+      </w:r>
+      <w:r>
         <w:t xml:space="preserve">Factor importance</w:t>
       </w:r>
     </w:p>
@@ -14708,6 +14950,15 @@
       <w:pPr>
         <w:pStyle w:val="Heading2"/>
       </w:pPr>
+      <w:r>
+        <w:rPr>
+          <w:rStyle w:val="SectionNumber"/>
+        </w:rPr>
+        <w:t xml:space="preserve">4.9</w:t>
+      </w:r>
+      <w:r>
+        <w:tab/>
+      </w:r>
       <w:r>
         <w:t xml:space="preserve">Robustness analysis</w:t>
       </w:r>
@@ -14903,13 +15154,22 @@
         <w:pStyle w:val="Heading2"/>
       </w:pPr>
       <w:r>
+        <w:rPr>
+          <w:rStyle w:val="SectionNumber"/>
+        </w:rPr>
+        <w:t xml:space="preserve">4.10</w:t>
+      </w:r>
+      <w:r>
+        <w:tab/>
+      </w:r>
+      <w:r>
         <w:t xml:space="preserve">Extended statistical analyses</w:t>
       </w:r>
     </w:p>
     <w:bookmarkStart w:id="56" w:name="X1f0fa747d214b73990f13d834bc0dd3912a815b"/>
     <w:p>
       <w:pPr>
-        <w:pStyle w:val="Heading4"/>
+        <w:pStyle w:val="Heading3"/>
       </w:pPr>
       <w:r>
         <w:t xml:space="preserve">Shapley decomposition of explained variance</w:t>
@@ -15325,6 +15585,25 @@
             </m:rPr>
             <m:t>,</m:t>
           </m:r>
+          <m:r>
+            <m:t>  </m:t>
+          </m:r>
+          <m:r>
+            <m:t>  </m:t>
+          </m:r>
+          <m:d>
+            <m:dPr>
+              <m:begChr m:val="("/>
+              <m:endChr m:val=")"/>
+              <m:sepChr m:val=""/>
+              <m:grow/>
+            </m:dPr>
+            <m:e>
+              <m:r>
+                <m:t>7</m:t>
+              </m:r>
+            </m:e>
+          </m:d>
         </m:oMath>
       </m:oMathPara>
     </w:p>
@@ -15480,7 +15759,7 @@
     <w:bookmarkStart w:id="57" w:name="multilevel-modelling"/>
     <w:p>
       <w:pPr>
-        <w:pStyle w:val="Heading4"/>
+        <w:pStyle w:val="Heading3"/>
       </w:pPr>
       <w:r>
         <w:t xml:space="preserve">Multilevel modelling</w:t>
@@ -16374,7 +16653,7 @@
     <w:bookmarkStart w:id="58" w:name="quantile-regression"/>
     <w:p>
       <w:pPr>
-        <w:pStyle w:val="Heading4"/>
+        <w:pStyle w:val="Heading3"/>
       </w:pPr>
       <w:r>
         <w:t xml:space="preserve">Quantile regression</w:t>
@@ -16867,7 +17146,7 @@
     <w:bookmarkStart w:id="59" w:name="effect-sizes-and-equivalence-tests"/>
     <w:p>
       <w:pPr>
-        <w:pStyle w:val="Heading4"/>
+        <w:pStyle w:val="Heading3"/>
       </w:pPr>
       <w:r>
         <w:t xml:space="preserve">Effect sizes and equivalence tests</w:t>
@@ -17344,7 +17623,7 @@
     <w:bookmarkStart w:id="60" w:name="measurement-invariance"/>
     <w:p>
       <w:pPr>
-        <w:pStyle w:val="Heading4"/>
+        <w:pStyle w:val="Heading3"/>
       </w:pPr>
       <w:r>
         <w:t xml:space="preserve">Measurement invariance</w:t>
@@ -17647,6 +17926,25 @@
             </m:rPr>
             <m:t>,</m:t>
           </m:r>
+          <m:r>
+            <m:t>  </m:t>
+          </m:r>
+          <m:r>
+            <m:t>  </m:t>
+          </m:r>
+          <m:d>
+            <m:dPr>
+              <m:begChr m:val="("/>
+              <m:endChr m:val=")"/>
+              <m:sepChr m:val=""/>
+              <m:grow/>
+            </m:dPr>
+            <m:e>
+              <m:r>
+                <m:t>8</m:t>
+              </m:r>
+            </m:e>
+          </m:d>
         </m:oMath>
       </m:oMathPara>
     </w:p>
@@ -17684,7 +17982,7 @@
         <w:t xml:space="preserve"> </w:t>
       </w:r>
       <w:r>
-        <w:t xml:space="preserve">(Lorenzo-Seva and Berge 2006)</w:t>
+        <w:t xml:space="preserve">(Lorenzo-Seva and ten Berge 2006)</w:t>
       </w:r>
       <w:r>
         <w:t xml:space="preserve">.</w:t>
@@ -17694,7 +17992,7 @@
     <w:bookmarkStart w:id="61" w:name="student-typologies"/>
     <w:p>
       <w:pPr>
-        <w:pStyle w:val="Heading4"/>
+        <w:pStyle w:val="Heading3"/>
       </w:pPr>
       <w:r>
         <w:t xml:space="preserve">Student typologies</w:t>
@@ -17932,6 +18230,15 @@
         <w:pStyle w:val="Heading2"/>
       </w:pPr>
       <w:r>
+        <w:rPr>
+          <w:rStyle w:val="SectionNumber"/>
+        </w:rPr>
+        <w:t xml:space="preserve">4.11</w:t>
+      </w:r>
+      <w:r>
+        <w:tab/>
+      </w:r>
+      <w:r>
         <w:t xml:space="preserve">Subgroup analysis and software</w:t>
       </w:r>
     </w:p>
@@ -17972,7 +18279,7 @@
         <w:t xml:space="preserve">(Pedregosa et al. 2011)</w:t>
       </w:r>
       <w:r>
-        <w:t xml:space="preserve">. The CFA was estimated with a purpose-written maximum-likelihood routine (SciPy L-BFGS-B). A fixed random seed (2024) was used throughout. The complete pipeline, which regenerates every table and figure, is available in the replication package (see Data and code availability).</w:t>
+        <w:t xml:space="preserve">. The CFA was estimated with a purpose-written maximum-likelihood routine (SciPy L-BFGS-B). A fixed random seed (2024) was used throughout. The complete pipeline, which regenerates every table and figure, is available from the author (see Declarations).</w:t>
       </w:r>
     </w:p>
     <w:bookmarkEnd w:id="63"/>
@@ -17983,6 +18290,15 @@
         <w:pStyle w:val="Heading1"/>
       </w:pPr>
       <w:r>
+        <w:rPr>
+          <w:rStyle w:val="SectionNumber"/>
+        </w:rPr>
+        <w:t xml:space="preserve">5</w:t>
+      </w:r>
+      <w:r>
+        <w:tab/>
+      </w:r>
+      <w:r>
         <w:t xml:space="preserve">Results</w:t>
       </w:r>
     </w:p>
@@ -17991,6 +18307,15 @@
       <w:pPr>
         <w:pStyle w:val="Heading2"/>
       </w:pPr>
+      <w:r>
+        <w:rPr>
+          <w:rStyle w:val="SectionNumber"/>
+        </w:rPr>
+        <w:t xml:space="preserve">5.1</w:t>
+      </w:r>
+      <w:r>
+        <w:tab/>
+      </w:r>
       <w:r>
         <w:t xml:space="preserve">Measurement model</w:t>
       </w:r>
@@ -22459,6 +22784,15 @@
       <w:pPr>
         <w:pStyle w:val="Heading2"/>
       </w:pPr>
+      <w:r>
+        <w:rPr>
+          <w:rStyle w:val="SectionNumber"/>
+        </w:rPr>
+        <w:t xml:space="preserve">5.2</w:t>
+      </w:r>
+      <w:r>
+        <w:tab/>
+      </w:r>
       <w:r>
         <w:t xml:space="preserve">Factor profile</w:t>
       </w:r>
@@ -22564,6 +22898,15 @@
         <w:pStyle w:val="Heading2"/>
       </w:pPr>
       <w:r>
+        <w:rPr>
+          <w:rStyle w:val="SectionNumber"/>
+        </w:rPr>
+        <w:t xml:space="preserve">5.3</w:t>
+      </w:r>
+      <w:r>
+        <w:tab/>
+      </w:r>
+      <w:r>
         <w:t xml:space="preserve">Overall feasibility score and its validity (RQ3)</w:t>
       </w:r>
     </w:p>
@@ -22823,6 +23166,15 @@
         <w:pStyle w:val="Heading2"/>
       </w:pPr>
       <w:r>
+        <w:rPr>
+          <w:rStyle w:val="SectionNumber"/>
+        </w:rPr>
+        <w:t xml:space="preserve">5.4</w:t>
+      </w:r>
+      <w:r>
+        <w:tab/>
+      </w:r>
+      <w:r>
         <w:t xml:space="preserve">Feasibility of individual teaching activities (RQ1, RQ4)</w:t>
       </w:r>
     </w:p>
@@ -25040,6 +25392,15 @@
         <w:pStyle w:val="Heading2"/>
       </w:pPr>
       <w:r>
+        <w:rPr>
+          <w:rStyle w:val="SectionNumber"/>
+        </w:rPr>
+        <w:t xml:space="preserve">5.5</w:t>
+      </w:r>
+      <w:r>
+        <w:tab/>
+      </w:r>
+      <w:r>
         <w:t xml:space="preserve">Fuzzy versus neural modelling (RQ3)</w:t>
       </w:r>
     </w:p>
@@ -26608,6 +26969,15 @@
         <w:pStyle w:val="Heading2"/>
       </w:pPr>
       <w:r>
+        <w:rPr>
+          <w:rStyle w:val="SectionNumber"/>
+        </w:rPr>
+        <w:t xml:space="preserve">5.6</w:t>
+      </w:r>
+      <w:r>
+        <w:tab/>
+      </w:r>
+      <w:r>
         <w:t xml:space="preserve">Determinants of feasibility (RQ2)</w:t>
       </w:r>
     </w:p>
@@ -27817,6 +28187,15 @@
         <w:pStyle w:val="Heading2"/>
       </w:pPr>
       <w:r>
+        <w:rPr>
+          <w:rStyle w:val="SectionNumber"/>
+        </w:rPr>
+        <w:t xml:space="preserve">5.7</w:t>
+      </w:r>
+      <w:r>
+        <w:tab/>
+      </w:r>
+      <w:r>
         <w:t xml:space="preserve">Robustness and subgroups</w:t>
       </w:r>
     </w:p>
@@ -28022,6 +28401,15 @@
         <w:pStyle w:val="Heading2"/>
       </w:pPr>
       <w:r>
+        <w:rPr>
+          <w:rStyle w:val="SectionNumber"/>
+        </w:rPr>
+        <w:t xml:space="preserve">5.8</w:t>
+      </w:r>
+      <w:r>
+        <w:tab/>
+      </w:r>
+      <w:r>
         <w:t xml:space="preserve">Mathematical verification</w:t>
       </w:r>
     </w:p>
@@ -28155,6 +28543,15 @@
       <w:pPr>
         <w:pStyle w:val="Heading2"/>
       </w:pPr>
+      <w:r>
+        <w:rPr>
+          <w:rStyle w:val="SectionNumber"/>
+        </w:rPr>
+        <w:t xml:space="preserve">5.9</w:t>
+      </w:r>
+      <w:r>
+        <w:tab/>
+      </w:r>
       <w:r>
         <w:t xml:space="preserve">Exact decomposition of explained variance</w:t>
       </w:r>
@@ -29559,6 +29956,15 @@
         <w:pStyle w:val="Heading2"/>
       </w:pPr>
       <w:r>
+        <w:rPr>
+          <w:rStyle w:val="SectionNumber"/>
+        </w:rPr>
+        <w:t xml:space="preserve">5.10</w:t>
+      </w:r>
+      <w:r>
+        <w:tab/>
+      </w:r>
+      <w:r>
         <w:t xml:space="preserve">Country-level variation</w:t>
       </w:r>
     </w:p>
@@ -29817,6 +30223,15 @@
         <w:pStyle w:val="Heading2"/>
       </w:pPr>
       <w:r>
+        <w:rPr>
+          <w:rStyle w:val="SectionNumber"/>
+        </w:rPr>
+        <w:t xml:space="preserve">5.11</w:t>
+      </w:r>
+      <w:r>
+        <w:tab/>
+      </w:r>
+      <w:r>
         <w:t xml:space="preserve">Heterogeneity across the criterion distribution and across students</w:t>
       </w:r>
     </w:p>
@@ -30242,6 +30657,15 @@
         <w:pStyle w:val="Heading2"/>
       </w:pPr>
       <w:r>
+        <w:rPr>
+          <w:rStyle w:val="SectionNumber"/>
+        </w:rPr>
+        <w:t xml:space="preserve">5.12</w:t>
+      </w:r>
+      <w:r>
+        <w:tab/>
+      </w:r>
+      <w:r>
         <w:t xml:space="preserve">Effect sizes, practical equivalence and measurement invariance</w:t>
       </w:r>
     </w:p>
@@ -32344,6 +32768,15 @@
         <w:pStyle w:val="Heading1"/>
       </w:pPr>
       <w:r>
+        <w:rPr>
+          <w:rStyle w:val="SectionNumber"/>
+        </w:rPr>
+        <w:t xml:space="preserve">6</w:t>
+      </w:r>
+      <w:r>
+        <w:tab/>
+      </w:r>
+      <w:r>
         <w:t xml:space="preserve">Discussion</w:t>
       </w:r>
     </w:p>
@@ -32352,6 +32785,15 @@
       <w:pPr>
         <w:pStyle w:val="Heading2"/>
       </w:pPr>
+      <w:r>
+        <w:rPr>
+          <w:rStyle w:val="SectionNumber"/>
+        </w:rPr>
+        <w:t xml:space="preserve">6.1</w:t>
+      </w:r>
+      <w:r>
+        <w:tab/>
+      </w:r>
       <w:r>
         <w:t xml:space="preserve">Answers to the research questions</w:t>
       </w:r>
@@ -32559,6 +33001,15 @@
         <w:pStyle w:val="Heading2"/>
       </w:pPr>
       <w:r>
+        <w:rPr>
+          <w:rStyle w:val="SectionNumber"/>
+        </w:rPr>
+        <w:t xml:space="preserve">6.2</w:t>
+      </w:r>
+      <w:r>
+        <w:tab/>
+      </w:r>
+      <w:r>
         <w:t xml:space="preserve">Heterogeneity and the mathematical guarantees</w:t>
       </w:r>
     </w:p>
@@ -32613,6 +33064,15 @@
         <w:pStyle w:val="Heading2"/>
       </w:pPr>
       <w:r>
+        <w:rPr>
+          <w:rStyle w:val="SectionNumber"/>
+        </w:rPr>
+        <w:t xml:space="preserve">6.3</w:t>
+      </w:r>
+      <w:r>
+        <w:tab/>
+      </w:r>
+      <w:r>
         <w:t xml:space="preserve">The normative–empirical gap on ethics</w:t>
       </w:r>
     </w:p>
@@ -32659,6 +33119,15 @@
       <w:pPr>
         <w:pStyle w:val="Heading2"/>
       </w:pPr>
+      <w:r>
+        <w:rPr>
+          <w:rStyle w:val="SectionNumber"/>
+        </w:rPr>
+        <w:t xml:space="preserve">6.4</w:t>
+      </w:r>
+      <w:r>
+        <w:tab/>
+      </w:r>
       <w:r>
         <w:t xml:space="preserve">Practical implications: a task-level collaboration model</w:t>
       </w:r>
@@ -32750,6 +33219,15 @@
         <w:pStyle w:val="Heading1"/>
       </w:pPr>
       <w:r>
+        <w:rPr>
+          <w:rStyle w:val="SectionNumber"/>
+        </w:rPr>
+        <w:t xml:space="preserve">7</w:t>
+      </w:r>
+      <w:r>
+        <w:tab/>
+      </w:r>
+      <w:r>
         <w:t xml:space="preserve">Limitations and future work</w:t>
       </w:r>
     </w:p>
@@ -32798,11 +33276,20 @@
       </w:r>
     </w:p>
     <w:bookmarkEnd w:id="122"/>
-    <w:bookmarkStart w:id="124" w:name="conclusion"/>
+    <w:bookmarkStart w:id="123" w:name="conclusion"/>
     <w:p>
       <w:pPr>
         <w:pStyle w:val="Heading1"/>
       </w:pPr>
+      <w:r>
+        <w:rPr>
+          <w:rStyle w:val="SectionNumber"/>
+        </w:rPr>
+        <w:t xml:space="preserve">8</w:t>
+      </w:r>
+      <w:r>
+        <w:tab/>
+      </w:r>
       <w:r>
         <w:t xml:space="preserve">Conclusion</w:t>
       </w:r>
@@ -32833,10 +33320,11 @@
         <w:t xml:space="preserve">into a measurable, task-level assessment. A hierarchical fuzzy inference system combined eight validated evaluation factors from more than eleven thousand students in 92 countries into an interpretable Teacher Replacement Feasibility Score. Neural and conventional learners were used to validate and benchmark it. Students regard AI as most capable for explanatory and question-answering work and least capable for assessment, motivation, socio-emotional support and the development of higher-order thinking. However, no teaching activity reaches the threshold for full replacement, and reliability is the decisive bottleneck. The future of higher education suggested by these data is therefore not one of teacher replacement. It is one of deliberate human–AI collaboration, in which AI takes on routine explanatory work and human teachers retain responsibility for judgement, motivation, mentoring and care.</w:t>
       </w:r>
     </w:p>
-    <w:bookmarkStart w:id="123" w:name="acknowledgements"/>
+    <w:bookmarkEnd w:id="123"/>
+    <w:bookmarkStart w:id="124" w:name="acknowledgements"/>
     <w:p>
       <w:pPr>
-        <w:pStyle w:val="Heading2"/>
+        <w:pStyle w:val="Heading1"/>
       </w:pPr>
       <w:r>
         <w:t xml:space="preserve">Acknowledgements</w:t>
@@ -32850,9 +33338,8 @@
         <w:t xml:space="preserve">The author thanks D. Ravšelj, A. Aristovnik and the Global ChatGPT Student Survey consortium for making their data openly available.</w:t>
       </w:r>
     </w:p>
-    <w:bookmarkEnd w:id="123"/>
     <w:bookmarkEnd w:id="124"/>
-    <w:bookmarkStart w:id="126" w:name="declarations"/>
+    <w:bookmarkStart w:id="125" w:name="declarations"/>
     <w:p>
       <w:pPr>
         <w:pStyle w:val="Heading1"/>
@@ -32879,7 +33366,7 @@
         <w:t xml:space="preserve"> </w:t>
       </w:r>
       <w:r>
-        <w:t xml:space="preserve">[This research did not receive any specific grant from funding agencies in the public, commercial, or not-for-profit sectors.]</w:t>
+        <w:t xml:space="preserve">The author did not receive support from any organization for the submitted work.</w:t>
       </w:r>
     </w:p>
     <w:p>
@@ -33002,36 +33489,7 @@
         <w:t xml:space="preserve"> </w:t>
       </w:r>
       <w:r>
-        <w:t xml:space="preserve">The complete analysis code and a runnable Jupyter/Colab notebook are available in the folder</w:t>
-      </w:r>
-      <w:r>
-        <w:t xml:space="preserve"> </w:t>
-      </w:r>
-      <w:r>
-        <w:rPr>
-          <w:rStyle w:val="VerbatimChar"/>
-        </w:rPr>
-        <w:t xml:space="preserve">ai-teacher-feasibility</w:t>
-      </w:r>
-      <w:r>
-        <w:t xml:space="preserve"> </w:t>
-      </w:r>
-      <w:r>
-        <w:t xml:space="preserve">of</w:t>
-      </w:r>
-      <w:r>
-        <w:t xml:space="preserve"> </w:t>
-      </w:r>
-      <w:hyperlink r:id="rId125">
-        <w:r>
-          <w:rPr>
-            <w:rStyle w:val="Hyperlink"/>
-          </w:rPr>
-          <w:t xml:space="preserve">https://github.com/isratjahan829/Data-Visualization</w:t>
-        </w:r>
-      </w:hyperlink>
-      <w:r>
-        <w:t xml:space="preserve">.</w:t>
+        <w:t xml:space="preserve">The analysis code (Python) that reproduces all tables and figures is available from the corresponding author on reasonable request.</w:t>
       </w:r>
     </w:p>
     <w:p>
@@ -33052,7 +33510,7 @@
         <w:t xml:space="preserve"> </w:t>
       </w:r>
       <w:r>
-        <w:t xml:space="preserve">[To be completed by the author in line with the journal’s policy.]</w:t>
+        <w:t xml:space="preserve">During the preparation of this work the author used Claude (Anthropic), a large language model, to assist with writing the analysis code and drafting and editing the manuscript text. The author reviewed, verified and edited all analyses and text and takes full responsibility for the content of the publication.</w:t>
       </w:r>
     </w:p>
     <w:p>
@@ -33076,8 +33534,8 @@
         <w:t xml:space="preserve">M.B.S.: conceptualization, methodology, software, formal analysis, visualization, writing – original draft, writing – review &amp; editing.</w:t>
       </w:r>
     </w:p>
-    <w:bookmarkEnd w:id="126"/>
-    <w:bookmarkStart w:id="236" w:name="references"/>
+    <w:bookmarkEnd w:id="125"/>
+    <w:bookmarkStart w:id="237" w:name="references"/>
     <w:p>
       <w:pPr>
         <w:pStyle w:val="Heading1"/>
@@ -33086,8 +33544,8 @@
         <w:t xml:space="preserve">References</w:t>
       </w:r>
     </w:p>
-    <w:bookmarkStart w:id="235" w:name="refs"/>
-    <w:bookmarkStart w:id="128" w:name="ref-allen2019"/>
+    <w:bookmarkStart w:id="236" w:name="refs"/>
+    <w:bookmarkStart w:id="127" w:name="ref-allen2019"/>
     <w:p>
       <w:pPr>
         <w:pStyle w:val="Bibliography"/>
@@ -33120,7 +33578,7 @@
       <w:r>
         <w:t xml:space="preserve"> </w:t>
       </w:r>
-      <w:hyperlink r:id="rId127">
+      <w:hyperlink r:id="rId126">
         <w:r>
           <w:rPr>
             <w:rStyle w:val="Hyperlink"/>
@@ -33132,8 +33590,8 @@
         <w:t xml:space="preserve">.</w:t>
       </w:r>
     </w:p>
-    <w:bookmarkEnd w:id="128"/>
-    <w:bookmarkStart w:id="130" w:name="ref-autor2003"/>
+    <w:bookmarkEnd w:id="127"/>
+    <w:bookmarkStart w:id="129" w:name="ref-autor2003"/>
     <w:p>
       <w:pPr>
         <w:pStyle w:val="Bibliography"/>
@@ -33166,7 +33624,7 @@
       <w:r>
         <w:t xml:space="preserve"> </w:t>
       </w:r>
-      <w:hyperlink r:id="rId129">
+      <w:hyperlink r:id="rId128">
         <w:r>
           <w:rPr>
             <w:rStyle w:val="Hyperlink"/>
@@ -33178,8 +33636,8 @@
         <w:t xml:space="preserve">.</w:t>
       </w:r>
     </w:p>
-    <w:bookmarkEnd w:id="130"/>
-    <w:bookmarkStart w:id="131" w:name="ref-biswas1995"/>
+    <w:bookmarkEnd w:id="129"/>
+    <w:bookmarkStart w:id="130" w:name="ref-biswas1995"/>
     <w:p>
       <w:pPr>
         <w:pStyle w:val="Bibliography"/>
@@ -33210,8 +33668,8 @@
         <w:t xml:space="preserve">74 (2): 187–94.</w:t>
       </w:r>
     </w:p>
-    <w:bookmarkEnd w:id="131"/>
-    <w:bookmarkStart w:id="133" w:name="ref-bond2024"/>
+    <w:bookmarkEnd w:id="130"/>
+    <w:bookmarkStart w:id="132" w:name="ref-bond2024"/>
     <w:p>
       <w:pPr>
         <w:pStyle w:val="Bibliography"/>
@@ -33244,7 +33702,7 @@
       <w:r>
         <w:t xml:space="preserve"> </w:t>
       </w:r>
-      <w:hyperlink r:id="rId132">
+      <w:hyperlink r:id="rId131">
         <w:r>
           <w:rPr>
             <w:rStyle w:val="Hyperlink"/>
@@ -33256,8 +33714,8 @@
         <w:t xml:space="preserve">.</w:t>
       </w:r>
     </w:p>
-    <w:bookmarkEnd w:id="133"/>
-    <w:bookmarkStart w:id="135" w:name="ref-breiman2001"/>
+    <w:bookmarkEnd w:id="132"/>
+    <w:bookmarkStart w:id="134" w:name="ref-breiman2001"/>
     <w:p>
       <w:pPr>
         <w:pStyle w:val="Bibliography"/>
@@ -33290,7 +33748,7 @@
       <w:r>
         <w:t xml:space="preserve"> </w:t>
       </w:r>
-      <w:hyperlink r:id="rId134">
+      <w:hyperlink r:id="rId133">
         <w:r>
           <w:rPr>
             <w:rStyle w:val="Hyperlink"/>
@@ -33302,8 +33760,8 @@
         <w:t xml:space="preserve">.</w:t>
       </w:r>
     </w:p>
-    <w:bookmarkEnd w:id="135"/>
-    <w:bookmarkStart w:id="137" w:name="ref-budescu1993"/>
+    <w:bookmarkEnd w:id="134"/>
+    <w:bookmarkStart w:id="136" w:name="ref-budescu1993"/>
     <w:p>
       <w:pPr>
         <w:pStyle w:val="Bibliography"/>
@@ -33336,7 +33794,7 @@
       <w:r>
         <w:t xml:space="preserve"> </w:t>
       </w:r>
-      <w:hyperlink r:id="rId136">
+      <w:hyperlink r:id="rId135">
         <w:r>
           <w:rPr>
             <w:rStyle w:val="Hyperlink"/>
@@ -33348,8 +33806,8 @@
         <w:t xml:space="preserve">.</w:t>
       </w:r>
     </w:p>
-    <w:bookmarkEnd w:id="137"/>
-    <w:bookmarkStart w:id="139" w:name="ref-chanhu2023"/>
+    <w:bookmarkEnd w:id="136"/>
+    <w:bookmarkStart w:id="138" w:name="ref-chanhu2023"/>
     <w:p>
       <w:pPr>
         <w:pStyle w:val="Bibliography"/>
@@ -33391,7 +33849,7 @@
       <w:r>
         <w:t xml:space="preserve"> </w:t>
       </w:r>
-      <w:hyperlink r:id="rId138">
+      <w:hyperlink r:id="rId137">
         <w:r>
           <w:rPr>
             <w:rStyle w:val="Hyperlink"/>
@@ -33403,8 +33861,8 @@
         <w:t xml:space="preserve">.</w:t>
       </w:r>
     </w:p>
-    <w:bookmarkEnd w:id="139"/>
-    <w:bookmarkStart w:id="141" w:name="ref-chantsi2024"/>
+    <w:bookmarkEnd w:id="138"/>
+    <w:bookmarkStart w:id="140" w:name="ref-chantsi2024"/>
     <w:p>
       <w:pPr>
         <w:pStyle w:val="Bibliography"/>
@@ -33461,7 +33919,7 @@
       <w:r>
         <w:t xml:space="preserve"> </w:t>
       </w:r>
-      <w:hyperlink r:id="rId140">
+      <w:hyperlink r:id="rId139">
         <w:r>
           <w:rPr>
             <w:rStyle w:val="Hyperlink"/>
@@ -33473,8 +33931,8 @@
         <w:t xml:space="preserve">.</w:t>
       </w:r>
     </w:p>
-    <w:bookmarkEnd w:id="141"/>
-    <w:bookmarkStart w:id="142" w:name="ref-chenlee1999"/>
+    <w:bookmarkEnd w:id="140"/>
+    <w:bookmarkStart w:id="141" w:name="ref-chenlee1999"/>
     <w:p>
       <w:pPr>
         <w:pStyle w:val="Bibliography"/>
@@ -33505,8 +33963,8 @@
         <w:t xml:space="preserve">104 (2): 209–18.</w:t>
       </w:r>
     </w:p>
-    <w:bookmarkEnd w:id="142"/>
-    <w:bookmarkStart w:id="144" w:name="ref-cotton2024"/>
+    <w:bookmarkEnd w:id="141"/>
+    <w:bookmarkStart w:id="143" w:name="ref-cotton2024"/>
     <w:p>
       <w:pPr>
         <w:pStyle w:val="Bibliography"/>
@@ -33548,7 +34006,7 @@
       <w:r>
         <w:t xml:space="preserve"> </w:t>
       </w:r>
-      <w:hyperlink r:id="rId143">
+      <w:hyperlink r:id="rId142">
         <w:r>
           <w:rPr>
             <w:rStyle w:val="Hyperlink"/>
@@ -33560,8 +34018,8 @@
         <w:t xml:space="preserve">.</w:t>
       </w:r>
     </w:p>
-    <w:bookmarkEnd w:id="144"/>
-    <w:bookmarkStart w:id="146" w:name="ref-crompton2023"/>
+    <w:bookmarkEnd w:id="143"/>
+    <w:bookmarkStart w:id="145" w:name="ref-crompton2023"/>
     <w:p>
       <w:pPr>
         <w:pStyle w:val="Bibliography"/>
@@ -33594,7 +34052,7 @@
       <w:r>
         <w:t xml:space="preserve"> </w:t>
       </w:r>
-      <w:hyperlink r:id="rId145">
+      <w:hyperlink r:id="rId144">
         <w:r>
           <w:rPr>
             <w:rStyle w:val="Hyperlink"/>
@@ -33606,8 +34064,8 @@
         <w:t xml:space="preserve">.</w:t>
       </w:r>
     </w:p>
-    <w:bookmarkEnd w:id="146"/>
-    <w:bookmarkStart w:id="148" w:name="ref-cronbach1951"/>
+    <w:bookmarkEnd w:id="145"/>
+    <w:bookmarkStart w:id="147" w:name="ref-cronbach1951"/>
     <w:p>
       <w:pPr>
         <w:pStyle w:val="Bibliography"/>
@@ -33640,7 +34098,7 @@
       <w:r>
         <w:t xml:space="preserve"> </w:t>
       </w:r>
-      <w:hyperlink r:id="rId147">
+      <w:hyperlink r:id="rId146">
         <w:r>
           <w:rPr>
             <w:rStyle w:val="Hyperlink"/>
@@ -33652,8 +34110,8 @@
         <w:t xml:space="preserve">.</w:t>
       </w:r>
     </w:p>
-    <w:bookmarkEnd w:id="148"/>
-    <w:bookmarkStart w:id="150" w:name="ref-dwivedi2023"/>
+    <w:bookmarkEnd w:id="147"/>
+    <w:bookmarkStart w:id="149" w:name="ref-dwivedi2023"/>
     <w:p>
       <w:pPr>
         <w:pStyle w:val="Bibliography"/>
@@ -33734,7 +34192,7 @@
       <w:r>
         <w:t xml:space="preserve"> </w:t>
       </w:r>
-      <w:hyperlink r:id="rId149">
+      <w:hyperlink r:id="rId148">
         <w:r>
           <w:rPr>
             <w:rStyle w:val="Hyperlink"/>
@@ -33746,8 +34204,8 @@
         <w:t xml:space="preserve">.</w:t>
       </w:r>
     </w:p>
-    <w:bookmarkEnd w:id="150"/>
-    <w:bookmarkStart w:id="151" w:name="ref-efron1993"/>
+    <w:bookmarkEnd w:id="149"/>
+    <w:bookmarkStart w:id="150" w:name="ref-efron1993"/>
     <w:p>
       <w:pPr>
         <w:pStyle w:val="Bibliography"/>
@@ -33769,8 +34227,8 @@
         <w:t xml:space="preserve">. New York: Chapman &amp; Hall.</w:t>
       </w:r>
     </w:p>
-    <w:bookmarkEnd w:id="151"/>
-    <w:bookmarkStart w:id="153" w:name="ref-eloundou2024"/>
+    <w:bookmarkEnd w:id="150"/>
+    <w:bookmarkStart w:id="152" w:name="ref-eloundou2024"/>
     <w:p>
       <w:pPr>
         <w:pStyle w:val="Bibliography"/>
@@ -33830,7 +34288,7 @@
       <w:r>
         <w:t xml:space="preserve"> </w:t>
       </w:r>
-      <w:hyperlink r:id="rId152">
+      <w:hyperlink r:id="rId151">
         <w:r>
           <w:rPr>
             <w:rStyle w:val="Hyperlink"/>
@@ -33842,8 +34300,8 @@
         <w:t xml:space="preserve">.</w:t>
       </w:r>
     </w:p>
-    <w:bookmarkEnd w:id="153"/>
-    <w:bookmarkStart w:id="155" w:name="ref-fornell1981"/>
+    <w:bookmarkEnd w:id="152"/>
+    <w:bookmarkStart w:id="154" w:name="ref-fornell1981"/>
     <w:p>
       <w:pPr>
         <w:pStyle w:val="Bibliography"/>
@@ -33876,7 +34334,7 @@
       <w:r>
         <w:t xml:space="preserve"> </w:t>
       </w:r>
-      <w:hyperlink r:id="rId154">
+      <w:hyperlink r:id="rId153">
         <w:r>
           <w:rPr>
             <w:rStyle w:val="Hyperlink"/>
@@ -33888,8 +34346,8 @@
         <w:t xml:space="preserve">.</w:t>
       </w:r>
     </w:p>
-    <w:bookmarkEnd w:id="155"/>
-    <w:bookmarkStart w:id="157" w:name="ref-frey2017"/>
+    <w:bookmarkEnd w:id="154"/>
+    <w:bookmarkStart w:id="156" w:name="ref-frey2017"/>
     <w:p>
       <w:pPr>
         <w:pStyle w:val="Bibliography"/>
@@ -33922,7 +34380,7 @@
       <w:r>
         <w:t xml:space="preserve"> </w:t>
       </w:r>
-      <w:hyperlink r:id="rId156">
+      <w:hyperlink r:id="rId155">
         <w:r>
           <w:rPr>
             <w:rStyle w:val="Hyperlink"/>
@@ -33934,8 +34392,8 @@
         <w:t xml:space="preserve">.</w:t>
       </w:r>
     </w:p>
-    <w:bookmarkEnd w:id="157"/>
-    <w:bookmarkStart w:id="159" w:name="ref-friedman2001"/>
+    <w:bookmarkEnd w:id="156"/>
+    <w:bookmarkStart w:id="158" w:name="ref-friedman2001"/>
     <w:p>
       <w:pPr>
         <w:pStyle w:val="Bibliography"/>
@@ -33968,7 +34426,7 @@
       <w:r>
         <w:t xml:space="preserve"> </w:t>
       </w:r>
-      <w:hyperlink r:id="rId158">
+      <w:hyperlink r:id="rId157">
         <w:r>
           <w:rPr>
             <w:rStyle w:val="Hyperlink"/>
@@ -33980,8 +34438,8 @@
         <w:t xml:space="preserve">.</w:t>
       </w:r>
     </w:p>
-    <w:bookmarkEnd w:id="159"/>
-    <w:bookmarkStart w:id="161" w:name="ref-friedman1937"/>
+    <w:bookmarkEnd w:id="158"/>
+    <w:bookmarkStart w:id="160" w:name="ref-friedman1937"/>
     <w:p>
       <w:pPr>
         <w:pStyle w:val="Bibliography"/>
@@ -34014,7 +34472,7 @@
       <w:r>
         <w:t xml:space="preserve"> </w:t>
       </w:r>
-      <w:hyperlink r:id="rId160">
+      <w:hyperlink r:id="rId159">
         <w:r>
           <w:rPr>
             <w:rStyle w:val="Hyperlink"/>
@@ -34026,8 +34484,8 @@
         <w:t xml:space="preserve">.</w:t>
       </w:r>
     </w:p>
-    <w:bookmarkEnd w:id="161"/>
-    <w:bookmarkStart w:id="163" w:name="ref-henseler2015"/>
+    <w:bookmarkEnd w:id="160"/>
+    <w:bookmarkStart w:id="162" w:name="ref-henseler2015"/>
     <w:p>
       <w:pPr>
         <w:pStyle w:val="Bibliography"/>
@@ -34060,7 +34518,7 @@
       <w:r>
         <w:t xml:space="preserve"> </w:t>
       </w:r>
-      <w:hyperlink r:id="rId162">
+      <w:hyperlink r:id="rId161">
         <w:r>
           <w:rPr>
             <w:rStyle w:val="Hyperlink"/>
@@ -34072,8 +34530,8 @@
         <w:t xml:space="preserve">.</w:t>
       </w:r>
     </w:p>
-    <w:bookmarkEnd w:id="163"/>
-    <w:bookmarkStart w:id="164" w:name="ref-holm1979"/>
+    <w:bookmarkEnd w:id="162"/>
+    <w:bookmarkStart w:id="163" w:name="ref-holm1979"/>
     <w:p>
       <w:pPr>
         <w:pStyle w:val="Bibliography"/>
@@ -34104,8 +34562,8 @@
         <w:t xml:space="preserve">6 (2): 65–70.</w:t>
       </w:r>
     </w:p>
-    <w:bookmarkEnd w:id="164"/>
-    <w:bookmarkStart w:id="165" w:name="ref-holmes2019"/>
+    <w:bookmarkEnd w:id="163"/>
+    <w:bookmarkStart w:id="164" w:name="ref-holmes2019"/>
     <w:p>
       <w:pPr>
         <w:pStyle w:val="Bibliography"/>
@@ -34127,8 +34585,8 @@
         <w:t xml:space="preserve">. Boston, MA: Center for Curriculum Redesign.</w:t>
       </w:r>
     </w:p>
-    <w:bookmarkEnd w:id="165"/>
-    <w:bookmarkStart w:id="167" w:name="ref-hornik1989"/>
+    <w:bookmarkEnd w:id="164"/>
+    <w:bookmarkStart w:id="166" w:name="ref-hornik1989"/>
     <w:p>
       <w:pPr>
         <w:pStyle w:val="Bibliography"/>
@@ -34161,7 +34619,7 @@
       <w:r>
         <w:t xml:space="preserve"> </w:t>
       </w:r>
-      <w:hyperlink r:id="rId166">
+      <w:hyperlink r:id="rId165">
         <w:r>
           <w:rPr>
             <w:rStyle w:val="Hyperlink"/>
@@ -34173,8 +34631,8 @@
         <w:t xml:space="preserve">.</w:t>
       </w:r>
     </w:p>
-    <w:bookmarkEnd w:id="167"/>
-    <w:bookmarkStart w:id="169" w:name="ref-hu1999"/>
+    <w:bookmarkEnd w:id="166"/>
+    <w:bookmarkStart w:id="168" w:name="ref-hu1999"/>
     <w:p>
       <w:pPr>
         <w:pStyle w:val="Bibliography"/>
@@ -34207,7 +34665,7 @@
       <w:r>
         <w:t xml:space="preserve"> </w:t>
       </w:r>
-      <w:hyperlink r:id="rId168">
+      <w:hyperlink r:id="rId167">
         <w:r>
           <w:rPr>
             <w:rStyle w:val="Hyperlink"/>
@@ -34219,8 +34677,8 @@
         <w:t xml:space="preserve">.</w:t>
       </w:r>
     </w:p>
-    <w:bookmarkEnd w:id="169"/>
-    <w:bookmarkStart w:id="171" w:name="ref-hubert1985"/>
+    <w:bookmarkEnd w:id="168"/>
+    <w:bookmarkStart w:id="170" w:name="ref-hubert1985"/>
     <w:p>
       <w:pPr>
         <w:pStyle w:val="Bibliography"/>
@@ -34253,7 +34711,7 @@
       <w:r>
         <w:t xml:space="preserve"> </w:t>
       </w:r>
-      <w:hyperlink r:id="rId170">
+      <w:hyperlink r:id="rId169">
         <w:r>
           <w:rPr>
             <w:rStyle w:val="Hyperlink"/>
@@ -34265,8 +34723,8 @@
         <w:t xml:space="preserve">.</w:t>
       </w:r>
     </w:p>
-    <w:bookmarkEnd w:id="171"/>
-    <w:bookmarkStart w:id="173" w:name="ref-jang1993"/>
+    <w:bookmarkEnd w:id="170"/>
+    <w:bookmarkStart w:id="172" w:name="ref-jang1993"/>
     <w:p>
       <w:pPr>
         <w:pStyle w:val="Bibliography"/>
@@ -34305,7 +34763,7 @@
       <w:r>
         <w:t xml:space="preserve"> </w:t>
       </w:r>
-      <w:hyperlink r:id="rId172">
+      <w:hyperlink r:id="rId171">
         <w:r>
           <w:rPr>
             <w:rStyle w:val="Hyperlink"/>
@@ -34317,8 +34775,8 @@
         <w:t xml:space="preserve">.</w:t>
       </w:r>
     </w:p>
-    <w:bookmarkEnd w:id="173"/>
-    <w:bookmarkStart w:id="175" w:name="ref-kasneci2023"/>
+    <w:bookmarkEnd w:id="172"/>
+    <w:bookmarkStart w:id="174" w:name="ref-kasneci2023"/>
     <w:p>
       <w:pPr>
         <w:pStyle w:val="Bibliography"/>
@@ -34369,7 +34827,7 @@
       <w:r>
         <w:t xml:space="preserve"> </w:t>
       </w:r>
-      <w:hyperlink r:id="rId174">
+      <w:hyperlink r:id="rId173">
         <w:r>
           <w:rPr>
             <w:rStyle w:val="Hyperlink"/>
@@ -34381,8 +34839,8 @@
         <w:t xml:space="preserve">.</w:t>
       </w:r>
     </w:p>
-    <w:bookmarkEnd w:id="175"/>
-    <w:bookmarkStart w:id="176" w:name="ref-kingma2015"/>
+    <w:bookmarkEnd w:id="174"/>
+    <w:bookmarkStart w:id="175" w:name="ref-kingma2015"/>
     <w:p>
       <w:pPr>
         <w:pStyle w:val="Bibliography"/>
@@ -34416,8 +34874,8 @@
         <w:t xml:space="preserve">.</w:t>
       </w:r>
     </w:p>
-    <w:bookmarkEnd w:id="176"/>
-    <w:bookmarkStart w:id="177" w:name="ref-kline2016"/>
+    <w:bookmarkEnd w:id="175"/>
+    <w:bookmarkStart w:id="176" w:name="ref-kline2016"/>
     <w:p>
       <w:pPr>
         <w:pStyle w:val="Bibliography"/>
@@ -34439,8 +34897,8 @@
         <w:t xml:space="preserve">. 4th ed. New York: Guilford Press.</w:t>
       </w:r>
     </w:p>
-    <w:bookmarkEnd w:id="177"/>
-    <w:bookmarkStart w:id="179" w:name="ref-koenker1978"/>
+    <w:bookmarkEnd w:id="176"/>
+    <w:bookmarkStart w:id="178" w:name="ref-koenker1978"/>
     <w:p>
       <w:pPr>
         <w:pStyle w:val="Bibliography"/>
@@ -34473,7 +34931,7 @@
       <w:r>
         <w:t xml:space="preserve"> </w:t>
       </w:r>
-      <w:hyperlink r:id="rId178">
+      <w:hyperlink r:id="rId177">
         <w:r>
           <w:rPr>
             <w:rStyle w:val="Hyperlink"/>
@@ -34485,8 +34943,8 @@
         <w:t xml:space="preserve">.</w:t>
       </w:r>
     </w:p>
-    <w:bookmarkEnd w:id="179"/>
-    <w:bookmarkStart w:id="181" w:name="ref-kulik2016"/>
+    <w:bookmarkEnd w:id="178"/>
+    <w:bookmarkStart w:id="180" w:name="ref-kulik2016"/>
     <w:p>
       <w:pPr>
         <w:pStyle w:val="Bibliography"/>
@@ -34519,7 +34977,7 @@
       <w:r>
         <w:t xml:space="preserve"> </w:t>
       </w:r>
-      <w:hyperlink r:id="rId180">
+      <w:hyperlink r:id="rId179">
         <w:r>
           <w:rPr>
             <w:rStyle w:val="Hyperlink"/>
@@ -34531,8 +34989,8 @@
         <w:t xml:space="preserve">.</w:t>
       </w:r>
     </w:p>
-    <w:bookmarkEnd w:id="181"/>
-    <w:bookmarkStart w:id="183" w:name="ref-lakens2017"/>
+    <w:bookmarkEnd w:id="180"/>
+    <w:bookmarkStart w:id="182" w:name="ref-lakens2017"/>
     <w:p>
       <w:pPr>
         <w:pStyle w:val="Bibliography"/>
@@ -34565,7 +35023,7 @@
       <w:r>
         <w:t xml:space="preserve"> </w:t>
       </w:r>
-      <w:hyperlink r:id="rId182">
+      <w:hyperlink r:id="rId181">
         <w:r>
           <w:rPr>
             <w:rStyle w:val="Hyperlink"/>
@@ -34577,8 +35035,8 @@
         <w:t xml:space="preserve">.</w:t>
       </w:r>
     </w:p>
-    <w:bookmarkEnd w:id="183"/>
-    <w:bookmarkStart w:id="185" w:name="ref-lipovetsky2001"/>
+    <w:bookmarkEnd w:id="182"/>
+    <w:bookmarkStart w:id="184" w:name="ref-lipovetsky2001"/>
     <w:p>
       <w:pPr>
         <w:pStyle w:val="Bibliography"/>
@@ -34611,7 +35069,7 @@
       <w:r>
         <w:t xml:space="preserve"> </w:t>
       </w:r>
-      <w:hyperlink r:id="rId184">
+      <w:hyperlink r:id="rId183">
         <w:r>
           <w:rPr>
             <w:rStyle w:val="Hyperlink"/>
@@ -34623,8 +35081,8 @@
         <w:t xml:space="preserve">.</w:t>
       </w:r>
     </w:p>
-    <w:bookmarkEnd w:id="185"/>
-    <w:bookmarkStart w:id="187" w:name="ref-lloyd1982"/>
+    <w:bookmarkEnd w:id="184"/>
+    <w:bookmarkStart w:id="186" w:name="ref-lloyd1982"/>
     <w:p>
       <w:pPr>
         <w:pStyle w:val="Bibliography"/>
@@ -34666,7 +35124,7 @@
       <w:r>
         <w:t xml:space="preserve"> </w:t>
       </w:r>
-      <w:hyperlink r:id="rId186">
+      <w:hyperlink r:id="rId185">
         <w:r>
           <w:rPr>
             <w:rStyle w:val="Hyperlink"/>
@@ -34678,8 +35136,8 @@
         <w:t xml:space="preserve">.</w:t>
       </w:r>
     </w:p>
-    <w:bookmarkEnd w:id="187"/>
-    <w:bookmarkStart w:id="189" w:name="ref-lorenzo2006"/>
+    <w:bookmarkEnd w:id="186"/>
+    <w:bookmarkStart w:id="188" w:name="ref-lorenzo2006"/>
     <w:p>
       <w:pPr>
         <w:pStyle w:val="Bibliography"/>
@@ -34712,7 +35170,7 @@
       <w:r>
         <w:t xml:space="preserve"> </w:t>
       </w:r>
-      <w:hyperlink r:id="rId188">
+      <w:hyperlink r:id="rId187">
         <w:r>
           <w:rPr>
             <w:rStyle w:val="Hyperlink"/>
@@ -34724,8 +35182,8 @@
         <w:t xml:space="preserve">.</w:t>
       </w:r>
     </w:p>
-    <w:bookmarkEnd w:id="189"/>
-    <w:bookmarkStart w:id="190" w:name="ref-luckin2016"/>
+    <w:bookmarkEnd w:id="188"/>
+    <w:bookmarkStart w:id="189" w:name="ref-luckin2016"/>
     <w:p>
       <w:pPr>
         <w:pStyle w:val="Bibliography"/>
@@ -34775,8 +35233,8 @@
         <w:t xml:space="preserve">. London: Pearson.</w:t>
       </w:r>
     </w:p>
-    <w:bookmarkEnd w:id="190"/>
-    <w:bookmarkStart w:id="192" w:name="ref-machado2005"/>
+    <w:bookmarkEnd w:id="189"/>
+    <w:bookmarkStart w:id="191" w:name="ref-machado2005"/>
     <w:p>
       <w:pPr>
         <w:pStyle w:val="Bibliography"/>
@@ -34809,7 +35267,7 @@
       <w:r>
         <w:t xml:space="preserve"> </w:t>
       </w:r>
-      <w:hyperlink r:id="rId191">
+      <w:hyperlink r:id="rId190">
         <w:r>
           <w:rPr>
             <w:rStyle w:val="Hyperlink"/>
@@ -34821,8 +35279,8 @@
         <w:t xml:space="preserve">.</w:t>
       </w:r>
     </w:p>
-    <w:bookmarkEnd w:id="192"/>
-    <w:bookmarkStart w:id="194" w:name="ref-mamdani1975"/>
+    <w:bookmarkEnd w:id="191"/>
+    <w:bookmarkStart w:id="193" w:name="ref-mamdani1975"/>
     <w:p>
       <w:pPr>
         <w:pStyle w:val="Bibliography"/>
@@ -34855,7 +35313,7 @@
       <w:r>
         <w:t xml:space="preserve"> </w:t>
       </w:r>
-      <w:hyperlink r:id="rId193">
+      <w:hyperlink r:id="rId192">
         <w:r>
           <w:rPr>
             <w:rStyle w:val="Hyperlink"/>
@@ -34867,8 +35325,8 @@
         <w:t xml:space="preserve">.</w:t>
       </w:r>
     </w:p>
-    <w:bookmarkEnd w:id="194"/>
-    <w:bookmarkStart w:id="195" w:name="ref-unesco2023"/>
+    <w:bookmarkEnd w:id="193"/>
+    <w:bookmarkStart w:id="194" w:name="ref-unesco2023"/>
     <w:p>
       <w:pPr>
         <w:pStyle w:val="Bibliography"/>
@@ -34918,8 +35376,8 @@
         <w:t xml:space="preserve">. Paris: UNESCO.</w:t>
       </w:r>
     </w:p>
-    <w:bookmarkEnd w:id="195"/>
-    <w:bookmarkStart w:id="197" w:name="ref-nadeau2003"/>
+    <w:bookmarkEnd w:id="194"/>
+    <w:bookmarkStart w:id="196" w:name="ref-nadeau2003"/>
     <w:p>
       <w:pPr>
         <w:pStyle w:val="Bibliography"/>
@@ -34952,7 +35410,7 @@
       <w:r>
         <w:t xml:space="preserve"> </w:t>
       </w:r>
-      <w:hyperlink r:id="rId196">
+      <w:hyperlink r:id="rId195">
         <w:r>
           <w:rPr>
             <w:rStyle w:val="Hyperlink"/>
@@ -34964,8 +35422,8 @@
         <w:t xml:space="preserve">.</w:t>
       </w:r>
     </w:p>
-    <w:bookmarkEnd w:id="197"/>
-    <w:bookmarkStart w:id="199" w:name="ref-nakagawa2013"/>
+    <w:bookmarkEnd w:id="196"/>
+    <w:bookmarkStart w:id="198" w:name="ref-nakagawa2013"/>
     <w:p>
       <w:pPr>
         <w:pStyle w:val="Bibliography"/>
@@ -35021,7 +35479,7 @@
       <w:r>
         <w:t xml:space="preserve"> </w:t>
       </w:r>
-      <w:hyperlink r:id="rId198">
+      <w:hyperlink r:id="rId197">
         <w:r>
           <w:rPr>
             <w:rStyle w:val="Hyperlink"/>
@@ -35033,8 +35491,8 @@
         <w:t xml:space="preserve">.</w:t>
       </w:r>
     </w:p>
-    <w:bookmarkEnd w:id="199"/>
-    <w:bookmarkStart w:id="200" w:name="ref-pedregosa2011"/>
+    <w:bookmarkEnd w:id="198"/>
+    <w:bookmarkStart w:id="199" w:name="ref-pedregosa2011"/>
     <w:p>
       <w:pPr>
         <w:pStyle w:val="Bibliography"/>
@@ -35074,8 +35532,8 @@
         <w:t xml:space="preserve">12: 2825–30.</w:t>
       </w:r>
     </w:p>
-    <w:bookmarkEnd w:id="200"/>
-    <w:bookmarkStart w:id="202" w:name="ref-podsakoff2003"/>
+    <w:bookmarkEnd w:id="199"/>
+    <w:bookmarkStart w:id="201" w:name="ref-podsakoff2003"/>
     <w:p>
       <w:pPr>
         <w:pStyle w:val="Bibliography"/>
@@ -35108,7 +35566,7 @@
       <w:r>
         <w:t xml:space="preserve"> </w:t>
       </w:r>
-      <w:hyperlink r:id="rId201">
+      <w:hyperlink r:id="rId200">
         <w:r>
           <w:rPr>
             <w:rStyle w:val="Hyperlink"/>
@@ -35120,8 +35578,8 @@
         <w:t xml:space="preserve">.</w:t>
       </w:r>
     </w:p>
-    <w:bookmarkEnd w:id="202"/>
-    <w:bookmarkStart w:id="204" w:name="ref-popenici2017"/>
+    <w:bookmarkEnd w:id="201"/>
+    <w:bookmarkStart w:id="203" w:name="ref-popenici2017"/>
     <w:p>
       <w:pPr>
         <w:pStyle w:val="Bibliography"/>
@@ -35154,7 +35612,7 @@
       <w:r>
         <w:t xml:space="preserve"> </w:t>
       </w:r>
-      <w:hyperlink r:id="rId203">
+      <w:hyperlink r:id="rId202">
         <w:r>
           <w:rPr>
             <w:rStyle w:val="Hyperlink"/>
@@ -35166,8 +35624,8 @@
         <w:t xml:space="preserve">.</w:t>
       </w:r>
     </w:p>
-    <w:bookmarkEnd w:id="204"/>
-    <w:bookmarkStart w:id="205" w:name="ref-raudenbush2002"/>
+    <w:bookmarkEnd w:id="203"/>
+    <w:bookmarkStart w:id="204" w:name="ref-raudenbush2002"/>
     <w:p>
       <w:pPr>
         <w:pStyle w:val="Bibliography"/>
@@ -35189,8 +35647,8 @@
         <w:t xml:space="preserve">. 2nd ed. Thousand Oaks, CA: Sage.</w:t>
       </w:r>
     </w:p>
-    <w:bookmarkEnd w:id="205"/>
-    <w:bookmarkStart w:id="207" w:name="ref-ravselj2024data"/>
+    <w:bookmarkEnd w:id="204"/>
+    <w:bookmarkStart w:id="206" w:name="ref-ravselj2024data"/>
     <w:p>
       <w:pPr>
         <w:pStyle w:val="Bibliography"/>
@@ -35222,7 +35680,7 @@
       <w:r>
         <w:t xml:space="preserve"> </w:t>
       </w:r>
-      <w:hyperlink r:id="rId206">
+      <w:hyperlink r:id="rId205">
         <w:r>
           <w:rPr>
             <w:rStyle w:val="Hyperlink"/>
@@ -35234,8 +35692,8 @@
         <w:t xml:space="preserve">.</w:t>
       </w:r>
     </w:p>
-    <w:bookmarkEnd w:id="207"/>
-    <w:bookmarkStart w:id="209" w:name="ref-ravselj2025"/>
+    <w:bookmarkEnd w:id="206"/>
+    <w:bookmarkStart w:id="208" w:name="ref-ravselj2025"/>
     <w:p>
       <w:pPr>
         <w:pStyle w:val="Bibliography"/>
@@ -35277,7 +35735,7 @@
       <w:r>
         <w:t xml:space="preserve"> </w:t>
       </w:r>
-      <w:hyperlink r:id="rId208">
+      <w:hyperlink r:id="rId207">
         <w:r>
           <w:rPr>
             <w:rStyle w:val="Hyperlink"/>
@@ -35289,8 +35747,63 @@
         <w:t xml:space="preserve">.</w:t>
       </w:r>
     </w:p>
-    <w:bookmarkEnd w:id="209"/>
-    <w:bookmarkStart w:id="211" w:name="ref-romero2020"/>
+    <w:bookmarkEnd w:id="208"/>
+    <w:bookmarkStart w:id="210" w:name="ref-ravselj2026corr"/>
+    <w:p>
+      <w:pPr>
+        <w:pStyle w:val="Bibliography"/>
+      </w:pPr>
+      <w:r>
+        <w:t xml:space="preserve">——— et al. 2026.</w:t>
+      </w:r>
+      <w:r>
+        <w:t xml:space="preserve"> </w:t>
+      </w:r>
+      <w:r>
+        <w:t xml:space="preserve">“Correction: Higher Education Students’ Perceptions of</w:t>
+      </w:r>
+      <w:r>
+        <w:t xml:space="preserve"> </w:t>
+      </w:r>
+      <w:r>
+        <w:t xml:space="preserve">ChatGPT</w:t>
+      </w:r>
+      <w:r>
+        <w:t xml:space="preserve">: A Global Study of Early Reactions.”</w:t>
+      </w:r>
+      <w:r>
+        <w:t xml:space="preserve"> </w:t>
+      </w:r>
+      <w:r>
+        <w:rPr>
+          <w:iCs/>
+          <w:i/>
+        </w:rPr>
+        <w:t xml:space="preserve">PLOS ONE</w:t>
+      </w:r>
+      <w:r>
+        <w:t xml:space="preserve"> </w:t>
+      </w:r>
+      <w:r>
+        <w:t xml:space="preserve">21 (5): e0349691.</w:t>
+      </w:r>
+      <w:r>
+        <w:t xml:space="preserve"> </w:t>
+      </w:r>
+      <w:hyperlink r:id="rId209">
+        <w:r>
+          <w:rPr>
+            <w:rStyle w:val="Hyperlink"/>
+          </w:rPr>
+          <w:t xml:space="preserve">https://doi.org/10.1371/journal.pone.0349691</w:t>
+        </w:r>
+      </w:hyperlink>
+      <w:r>
+        <w:t xml:space="preserve">.</w:t>
+      </w:r>
+    </w:p>
+    <w:bookmarkEnd w:id="210"/>
+    <w:bookmarkStart w:id="212" w:name="ref-romero2020"/>
     <w:p>
       <w:pPr>
         <w:pStyle w:val="Bibliography"/>
@@ -35323,7 +35836,7 @@
       <w:r>
         <w:t xml:space="preserve"> </w:t>
       </w:r>
-      <w:hyperlink r:id="rId210">
+      <w:hyperlink r:id="rId211">
         <w:r>
           <w:rPr>
             <w:rStyle w:val="Hyperlink"/>
@@ -35335,8 +35848,8 @@
         <w:t xml:space="preserve">.</w:t>
       </w:r>
     </w:p>
-    <w:bookmarkEnd w:id="211"/>
-    <w:bookmarkStart w:id="212" w:name="ref-ross2010"/>
+    <w:bookmarkEnd w:id="212"/>
+    <w:bookmarkStart w:id="213" w:name="ref-ross2010"/>
     <w:p>
       <w:pPr>
         <w:pStyle w:val="Bibliography"/>
@@ -35358,8 +35871,8 @@
         <w:t xml:space="preserve">. 3rd ed. Chichester: Wiley.</w:t>
       </w:r>
     </w:p>
-    <w:bookmarkEnd w:id="212"/>
-    <w:bookmarkStart w:id="214" w:name="ref-rousseeuw1987"/>
+    <w:bookmarkEnd w:id="213"/>
+    <w:bookmarkStart w:id="215" w:name="ref-rousseeuw1987"/>
     <w:p>
       <w:pPr>
         <w:pStyle w:val="Bibliography"/>
@@ -35392,7 +35905,7 @@
       <w:r>
         <w:t xml:space="preserve"> </w:t>
       </w:r>
-      <w:hyperlink r:id="rId213">
+      <w:hyperlink r:id="rId214">
         <w:r>
           <w:rPr>
             <w:rStyle w:val="Hyperlink"/>
@@ -35404,8 +35917,8 @@
         <w:t xml:space="preserve">.</w:t>
       </w:r>
     </w:p>
-    <w:bookmarkEnd w:id="214"/>
-    <w:bookmarkStart w:id="216" w:name="ref-rudolph2023"/>
+    <w:bookmarkEnd w:id="215"/>
+    <w:bookmarkStart w:id="217" w:name="ref-rudolph2023"/>
     <w:p>
       <w:pPr>
         <w:pStyle w:val="Bibliography"/>
@@ -35444,7 +35957,7 @@
       <w:r>
         <w:t xml:space="preserve"> </w:t>
       </w:r>
-      <w:hyperlink r:id="rId215">
+      <w:hyperlink r:id="rId216">
         <w:r>
           <w:rPr>
             <w:rStyle w:val="Hyperlink"/>
@@ -35456,8 +35969,8 @@
         <w:t xml:space="preserve">.</w:t>
       </w:r>
     </w:p>
-    <w:bookmarkEnd w:id="216"/>
-    <w:bookmarkStart w:id="218" w:name="ref-rumelhart1986"/>
+    <w:bookmarkEnd w:id="217"/>
+    <w:bookmarkStart w:id="219" w:name="ref-rumelhart1986"/>
     <w:p>
       <w:pPr>
         <w:pStyle w:val="Bibliography"/>
@@ -35490,7 +36003,7 @@
       <w:r>
         <w:t xml:space="preserve"> </w:t>
       </w:r>
-      <w:hyperlink r:id="rId217">
+      <w:hyperlink r:id="rId218">
         <w:r>
           <w:rPr>
             <w:rStyle w:val="Hyperlink"/>
@@ -35502,8 +36015,8 @@
         <w:t xml:space="preserve">.</w:t>
       </w:r>
     </w:p>
-    <w:bookmarkEnd w:id="218"/>
-    <w:bookmarkStart w:id="220" w:name="ref-schuirmann1987"/>
+    <w:bookmarkEnd w:id="219"/>
+    <w:bookmarkStart w:id="221" w:name="ref-schuirmann1987"/>
     <w:p>
       <w:pPr>
         <w:pStyle w:val="Bibliography"/>
@@ -35536,7 +36049,7 @@
       <w:r>
         <w:t xml:space="preserve"> </w:t>
       </w:r>
-      <w:hyperlink r:id="rId219">
+      <w:hyperlink r:id="rId220">
         <w:r>
           <w:rPr>
             <w:rStyle w:val="Hyperlink"/>
@@ -35548,8 +36061,8 @@
         <w:t xml:space="preserve">.</w:t>
       </w:r>
     </w:p>
-    <w:bookmarkEnd w:id="220"/>
-    <w:bookmarkStart w:id="222" w:name="ref-self1987"/>
+    <w:bookmarkEnd w:id="221"/>
+    <w:bookmarkStart w:id="223" w:name="ref-self1987"/>
     <w:p>
       <w:pPr>
         <w:pStyle w:val="Bibliography"/>
@@ -35582,7 +36095,7 @@
       <w:r>
         <w:t xml:space="preserve"> </w:t>
       </w:r>
-      <w:hyperlink r:id="rId221">
+      <w:hyperlink r:id="rId222">
         <w:r>
           <w:rPr>
             <w:rStyle w:val="Hyperlink"/>
@@ -35594,8 +36107,8 @@
         <w:t xml:space="preserve">.</w:t>
       </w:r>
     </w:p>
-    <w:bookmarkEnd w:id="222"/>
-    <w:bookmarkStart w:id="223" w:name="ref-selwyn2019"/>
+    <w:bookmarkEnd w:id="223"/>
+    <w:bookmarkStart w:id="224" w:name="ref-selwyn2019"/>
     <w:p>
       <w:pPr>
         <w:pStyle w:val="Bibliography"/>
@@ -35645,8 +36158,8 @@
         <w:t xml:space="preserve">. Cambridge: Polity Press.</w:t>
       </w:r>
     </w:p>
-    <w:bookmarkEnd w:id="223"/>
-    <w:bookmarkStart w:id="225" w:name="ref-smola2004"/>
+    <w:bookmarkEnd w:id="224"/>
+    <w:bookmarkStart w:id="226" w:name="ref-smola2004"/>
     <w:p>
       <w:pPr>
         <w:pStyle w:val="Bibliography"/>
@@ -35679,7 +36192,7 @@
       <w:r>
         <w:t xml:space="preserve"> </w:t>
       </w:r>
-      <w:hyperlink r:id="rId224">
+      <w:hyperlink r:id="rId225">
         <w:r>
           <w:rPr>
             <w:rStyle w:val="Hyperlink"/>
@@ -35691,8 +36204,8 @@
         <w:t xml:space="preserve">.</w:t>
       </w:r>
     </w:p>
-    <w:bookmarkEnd w:id="225"/>
-    <w:bookmarkStart w:id="227" w:name="ref-vanlehn2011"/>
+    <w:bookmarkEnd w:id="226"/>
+    <w:bookmarkStart w:id="228" w:name="ref-vanlehn2011"/>
     <w:p>
       <w:pPr>
         <w:pStyle w:val="Bibliography"/>
@@ -35725,7 +36238,7 @@
       <w:r>
         <w:t xml:space="preserve"> </w:t>
       </w:r>
-      <w:hyperlink r:id="rId226">
+      <w:hyperlink r:id="rId227">
         <w:r>
           <w:rPr>
             <w:rStyle w:val="Hyperlink"/>
@@ -35737,8 +36250,8 @@
         <w:t xml:space="preserve">.</w:t>
       </w:r>
     </w:p>
-    <w:bookmarkEnd w:id="227"/>
-    <w:bookmarkStart w:id="229" w:name="ref-venkatesh2003"/>
+    <w:bookmarkEnd w:id="228"/>
+    <w:bookmarkStart w:id="230" w:name="ref-venkatesh2003"/>
     <w:p>
       <w:pPr>
         <w:pStyle w:val="Bibliography"/>
@@ -35771,7 +36284,7 @@
       <w:r>
         <w:t xml:space="preserve"> </w:t>
       </w:r>
-      <w:hyperlink r:id="rId228">
+      <w:hyperlink r:id="rId229">
         <w:r>
           <w:rPr>
             <w:rStyle w:val="Hyperlink"/>
@@ -35783,8 +36296,8 @@
         <w:t xml:space="preserve">.</w:t>
       </w:r>
     </w:p>
-    <w:bookmarkEnd w:id="229"/>
-    <w:bookmarkStart w:id="230" w:name="ref-wang1998"/>
+    <w:bookmarkEnd w:id="230"/>
+    <w:bookmarkStart w:id="231" w:name="ref-wang1998"/>
     <w:p>
       <w:pPr>
         <w:pStyle w:val="Bibliography"/>
@@ -35815,8 +36328,8 @@
         <w:t xml:space="preserve">93 (2): 223–30.</w:t>
       </w:r>
     </w:p>
-    <w:bookmarkEnd w:id="230"/>
-    <w:bookmarkStart w:id="232" w:name="ref-zadeh1965"/>
+    <w:bookmarkEnd w:id="231"/>
+    <w:bookmarkStart w:id="233" w:name="ref-zadeh1965"/>
     <w:p>
       <w:pPr>
         <w:pStyle w:val="Bibliography"/>
@@ -35849,7 +36362,7 @@
       <w:r>
         <w:t xml:space="preserve"> </w:t>
       </w:r>
-      <w:hyperlink r:id="rId231">
+      <w:hyperlink r:id="rId232">
         <w:r>
           <w:rPr>
             <w:rStyle w:val="Hyperlink"/>
@@ -35861,8 +36374,8 @@
         <w:t xml:space="preserve">.</w:t>
       </w:r>
     </w:p>
-    <w:bookmarkEnd w:id="232"/>
-    <w:bookmarkStart w:id="234" w:name="ref-zawacki2019"/>
+    <w:bookmarkEnd w:id="233"/>
+    <w:bookmarkStart w:id="235" w:name="ref-zawacki2019"/>
     <w:p>
       <w:pPr>
         <w:pStyle w:val="Bibliography"/>
@@ -35895,7 +36408,7 @@
       <w:r>
         <w:t xml:space="preserve"> </w:t>
       </w:r>
-      <w:hyperlink r:id="rId233">
+      <w:hyperlink r:id="rId234">
         <w:r>
           <w:rPr>
             <w:rStyle w:val="Hyperlink"/>
@@ -35907,16 +36420,35 @@
         <w:t xml:space="preserve">.</w:t>
       </w:r>
     </w:p>
-    <w:bookmarkEnd w:id="234"/>
     <w:bookmarkEnd w:id="235"/>
     <w:bookmarkEnd w:id="236"/>
-    <w:sectPr/>
+    <w:bookmarkEnd w:id="237"/>
+    <w:sectPr>
+      <w:footerReference w:type="default" r:id="rId9"/>
+      <w:lnNumType w:countBy="1" w:restart="continuous"/>
+    </w:sectPr>
   </w:body>
 </w:document>
 </file>
 
 <file path=word/comments.xml><?xml version="1.0" encoding="utf-8"?>
 <w:comments xmlns:w="http://schemas.openxmlformats.org/wordprocessingml/2006/main" xmlns:m="http://schemas.openxmlformats.org/officeDocument/2006/math" xmlns:r="http://schemas.openxmlformats.org/officeDocument/2006/relationships" xmlns:o="urn:schemas-microsoft-com:office:office" xmlns:v="urn:schemas-microsoft-com:vml" xmlns:w10="urn:schemas-microsoft-com:office:word" xmlns:a="http://schemas.openxmlformats.org/drawingml/2006/main" xmlns:pic="http://schemas.openxmlformats.org/drawingml/2006/picture" xmlns:wp="http://schemas.openxmlformats.org/drawingml/2006/wordprocessingDrawing"/>
+</file>
+
+<file path=word/footer1.xml><?xml version="1.0" encoding="utf-8"?>
+<w:ftr xmlns:m="http://schemas.openxmlformats.org/officeDocument/2006/math" xmlns:mc="http://schemas.openxmlformats.org/markup-compatibility/2006" xmlns:mo="http://schemas.microsoft.com/office/mac/office/2008/main" xmlns:mv="urn:schemas-microsoft-com:mac:vml" xmlns:o="urn:schemas-microsoft-com:office:office" xmlns:r="http://schemas.openxmlformats.org/officeDocument/2006/relationships" xmlns:v="urn:schemas-microsoft-com:vml" xmlns:w10="urn:schemas-microsoft-com:office:word" xmlns:w14="http://schemas.microsoft.com/office/word/2010/wordml" xmlns:w="http://schemas.openxmlformats.org/wordprocessingml/2006/main" xmlns:wne="http://schemas.microsoft.com/office/word/2006/wordml" xmlns:wp14="http://schemas.microsoft.com/office/word/2010/wordprocessingDrawing" xmlns:wp="http://schemas.openxmlformats.org/drawingml/2006/wordprocessingDrawing" xmlns:wpc="http://schemas.microsoft.com/office/word/2010/wordprocessingCanvas" xmlns:wpg="http://schemas.microsoft.com/office/word/2010/wordprocessingGroup" xmlns:wpi="http://schemas.microsoft.com/office/word/2010/wordprocessingInk" xmlns:wps="http://schemas.microsoft.com/office/word/2010/wordprocessingShape" mc:Ignorable="w14 wp14">
+  <w:p>
+    <w:pPr>
+      <w:pStyle w:val="Footer"/>
+      <w:jc w:val="center"/>
+    </w:pPr>
+    <w:r>
+      <w:fldChar w:fldCharType="begin"/>
+      <w:instrText xml:space="preserve">PAGE</w:instrText>
+      <w:fldChar w:fldCharType="end"/>
+    </w:r>
+  </w:p>
+</w:ftr>
 </file>
 
 <file path=word/footnotes.xml><?xml version="1.0" encoding="utf-8"?>

</xml_diff>